<commit_message>
Add Lab 04 daily inbox triage exercise (synced from Word workbook)
- Lab 04: new Exercise 3 daily inbox triage (prompt + validation), follow-up tracker renumbered to Exercise 4, duration 25 -> 35 min, scenario and learning objectives expanded

- How to use: reference the Lab 04 daily triage exercise; lab index Lab 04 -> 35 min

- index.md: Lab 04 -> 35 min

- Regenerate full_workbook.md
</commit_message>
<xml_diff>
--- a/docs/Assets/Copilot_MultiDept_Industry_Lab_Workbook.docx
+++ b/docs/Assets/Copilot_MultiDept_Industry_Lab_Workbook.docx
@@ -4487,7 +4487,7 @@
           <w:sz w:val="21"/>
           <w:szCs w:val="21"/>
         </w:rPr>
-        <w:t>Delivered end to end, the labs and capstone total roughly seven and a half hours of hands-on time - closer to eight once the forecasting and what-if exercises in Labs 05 and 06 are included - which is more than most groups absorb in one sitting. Three schedules work well. A two-hour taster covers Lab 00, one department lab chosen for the audience, and Lab 10. A full-day workshop covers Labs 00 to 07 in the morning and Labs 08 to 11 plus the capstone in the afternoon, choosing either Lab 05 or Lab 06 rather than both. A two-half-day format puts the productivity core on day one and the agents track, including Labs 12 and 13, on day two. Add about fifteen minutes per lab for debrief in a room of more than twenty people, and about ten minutes to whichever of Labs 05 and 06 you run if you include its scenario exercise.</w:t>
+        <w:t>Delivered end to end, the labs and capstone total roughly seven and a half hours of hands-on time - closer to eight and a quarter once the daily triage exercise in Lab 04 and the forecasting and what-if exercises in Labs 05 and 06 are included - which is more than most groups absorb in one sitting. Three schedules work well. A two-hour taster covers Lab 00, one department lab chosen for the audience, and Lab 10. A full-day workshop covers Labs 00 to 07 in the morning and Labs 08 to 11 plus the capstone in the afternoon, choosing either Lab 05 or Lab 06 rather than both. A two-half-day format puts the productivity core on day one and the agents track, including Labs 12 and 13, on day two. Add about fifteen minutes per lab for debrief in a room of more than twenty people, about ten minutes to Lab 04 if you run the daily triage exercise, and about ten minutes to whichever of Labs 05 and 06 you run if you include its scenario exercise.</w:t>
       </w:r>
     </w:p>
     <w:p xmlns:wp14="http://schemas.microsoft.com/office/word/2010/wordml" wp14:textId="77777777">
@@ -4521,7 +4521,8 @@
         <w:tc>
           <w:tcPr>
             <w:tcW w:w="576" w:type="dxa"/>
-            <w:shd w:val="clear" w:fill="0B3D2E"/>
+            <w:shd w:val="clear" w:color="auto" w:fill="0B3D2E"/>
+            <w:tcMar/>
           </w:tcPr>
           <w:p wp14:textId="77777777">
             <w:r>
@@ -4537,7 +4538,8 @@
         <w:tc>
           <w:tcPr>
             <w:tcW w:w="2880" w:type="dxa"/>
-            <w:shd w:val="clear" w:fill="0B3D2E"/>
+            <w:shd w:val="clear" w:color="auto" w:fill="0B3D2E"/>
+            <w:tcMar/>
           </w:tcPr>
           <w:p wp14:textId="77777777">
             <w:r>
@@ -4553,7 +4555,8 @@
         <w:tc>
           <w:tcPr>
             <w:tcW w:w="2448" w:type="dxa"/>
-            <w:shd w:val="clear" w:fill="0B3D2E"/>
+            <w:shd w:val="clear" w:color="auto" w:fill="0B3D2E"/>
+            <w:tcMar/>
           </w:tcPr>
           <w:p wp14:textId="77777777">
             <w:r>
@@ -4569,7 +4572,8 @@
         <w:tc>
           <w:tcPr>
             <w:tcW w:w="1728" w:type="dxa"/>
-            <w:shd w:val="clear" w:fill="0B3D2E"/>
+            <w:shd w:val="clear" w:color="auto" w:fill="0B3D2E"/>
+            <w:tcMar/>
           </w:tcPr>
           <w:p wp14:textId="77777777">
             <w:r>
@@ -4585,7 +4589,8 @@
         <w:tc>
           <w:tcPr>
             <w:tcW w:w="720" w:type="dxa"/>
-            <w:shd w:val="clear" w:fill="0B3D2E"/>
+            <w:shd w:val="clear" w:color="auto" w:fill="0B3D2E"/>
+            <w:tcMar/>
           </w:tcPr>
           <w:p wp14:textId="77777777">
             <w:r>
@@ -4601,7 +4606,8 @@
         <w:tc>
           <w:tcPr>
             <w:tcW w:w="864" w:type="dxa"/>
-            <w:shd w:val="clear" w:fill="0B3D2E"/>
+            <w:shd w:val="clear" w:color="auto" w:fill="0B3D2E"/>
+            <w:tcMar/>
           </w:tcPr>
           <w:p wp14:textId="77777777">
             <w:r>
@@ -4619,6 +4625,7 @@
         <w:tc>
           <w:tcPr>
             <w:tcW w:w="576" w:type="dxa"/>
+            <w:tcMar/>
           </w:tcPr>
           <w:p wp14:textId="77777777">
             <w:r>
@@ -4632,6 +4639,7 @@
         <w:tc>
           <w:tcPr>
             <w:tcW w:w="2880" w:type="dxa"/>
+            <w:tcMar/>
           </w:tcPr>
           <w:p wp14:textId="77777777">
             <w:r>
@@ -4645,6 +4653,7 @@
         <w:tc>
           <w:tcPr>
             <w:tcW w:w="2448" w:type="dxa"/>
+            <w:tcMar/>
           </w:tcPr>
           <w:p wp14:textId="77777777">
             <w:r>
@@ -4658,6 +4667,7 @@
         <w:tc>
           <w:tcPr>
             <w:tcW w:w="1728" w:type="dxa"/>
+            <w:tcMar/>
           </w:tcPr>
           <w:p wp14:textId="77777777">
             <w:r>
@@ -4671,6 +4681,7 @@
         <w:tc>
           <w:tcPr>
             <w:tcW w:w="720" w:type="dxa"/>
+            <w:tcMar/>
           </w:tcPr>
           <w:p wp14:textId="77777777">
             <w:r>
@@ -4684,6 +4695,7 @@
         <w:tc>
           <w:tcPr>
             <w:tcW w:w="864" w:type="dxa"/>
+            <w:tcMar/>
           </w:tcPr>
           <w:p wp14:textId="77777777">
             <w:r>
@@ -4699,6 +4711,7 @@
         <w:tc>
           <w:tcPr>
             <w:tcW w:w="576" w:type="dxa"/>
+            <w:tcMar/>
           </w:tcPr>
           <w:p wp14:textId="77777777">
             <w:r>
@@ -4712,6 +4725,7 @@
         <w:tc>
           <w:tcPr>
             <w:tcW w:w="2880" w:type="dxa"/>
+            <w:tcMar/>
           </w:tcPr>
           <w:p wp14:textId="77777777">
             <w:r>
@@ -4725,6 +4739,7 @@
         <w:tc>
           <w:tcPr>
             <w:tcW w:w="2448" w:type="dxa"/>
+            <w:tcMar/>
           </w:tcPr>
           <w:p wp14:textId="77777777">
             <w:r>
@@ -4738,6 +4753,7 @@
         <w:tc>
           <w:tcPr>
             <w:tcW w:w="1728" w:type="dxa"/>
+            <w:tcMar/>
           </w:tcPr>
           <w:p wp14:textId="77777777">
             <w:r>
@@ -4751,6 +4767,7 @@
         <w:tc>
           <w:tcPr>
             <w:tcW w:w="720" w:type="dxa"/>
+            <w:tcMar/>
           </w:tcPr>
           <w:p wp14:textId="77777777">
             <w:r>
@@ -4764,6 +4781,7 @@
         <w:tc>
           <w:tcPr>
             <w:tcW w:w="864" w:type="dxa"/>
+            <w:tcMar/>
           </w:tcPr>
           <w:p wp14:textId="77777777">
             <w:r>
@@ -4779,6 +4797,7 @@
         <w:tc>
           <w:tcPr>
             <w:tcW w:w="576" w:type="dxa"/>
+            <w:tcMar/>
           </w:tcPr>
           <w:p wp14:textId="77777777">
             <w:r>
@@ -4792,6 +4811,7 @@
         <w:tc>
           <w:tcPr>
             <w:tcW w:w="2880" w:type="dxa"/>
+            <w:tcMar/>
           </w:tcPr>
           <w:p wp14:textId="77777777">
             <w:r>
@@ -4805,6 +4825,7 @@
         <w:tc>
           <w:tcPr>
             <w:tcW w:w="2448" w:type="dxa"/>
+            <w:tcMar/>
           </w:tcPr>
           <w:p wp14:textId="77777777">
             <w:r>
@@ -4818,6 +4839,7 @@
         <w:tc>
           <w:tcPr>
             <w:tcW w:w="1728" w:type="dxa"/>
+            <w:tcMar/>
           </w:tcPr>
           <w:p wp14:textId="77777777">
             <w:r>
@@ -4831,6 +4853,7 @@
         <w:tc>
           <w:tcPr>
             <w:tcW w:w="720" w:type="dxa"/>
+            <w:tcMar/>
           </w:tcPr>
           <w:p wp14:textId="77777777">
             <w:r>
@@ -4844,6 +4867,7 @@
         <w:tc>
           <w:tcPr>
             <w:tcW w:w="864" w:type="dxa"/>
+            <w:tcMar/>
           </w:tcPr>
           <w:p wp14:textId="77777777">
             <w:r>
@@ -4859,6 +4883,7 @@
         <w:tc>
           <w:tcPr>
             <w:tcW w:w="576" w:type="dxa"/>
+            <w:tcMar/>
           </w:tcPr>
           <w:p wp14:textId="77777777">
             <w:r>
@@ -4872,6 +4897,7 @@
         <w:tc>
           <w:tcPr>
             <w:tcW w:w="2880" w:type="dxa"/>
+            <w:tcMar/>
           </w:tcPr>
           <w:p wp14:textId="77777777">
             <w:r>
@@ -4885,6 +4911,7 @@
         <w:tc>
           <w:tcPr>
             <w:tcW w:w="2448" w:type="dxa"/>
+            <w:tcMar/>
           </w:tcPr>
           <w:p wp14:textId="77777777">
             <w:r>
@@ -4898,6 +4925,7 @@
         <w:tc>
           <w:tcPr>
             <w:tcW w:w="1728" w:type="dxa"/>
+            <w:tcMar/>
           </w:tcPr>
           <w:p wp14:textId="77777777">
             <w:r>
@@ -4911,6 +4939,7 @@
         <w:tc>
           <w:tcPr>
             <w:tcW w:w="720" w:type="dxa"/>
+            <w:tcMar/>
           </w:tcPr>
           <w:p wp14:textId="77777777">
             <w:r>
@@ -4924,6 +4953,7 @@
         <w:tc>
           <w:tcPr>
             <w:tcW w:w="864" w:type="dxa"/>
+            <w:tcMar/>
           </w:tcPr>
           <w:p wp14:textId="77777777">
             <w:r>
@@ -4939,6 +4969,7 @@
         <w:tc>
           <w:tcPr>
             <w:tcW w:w="576" w:type="dxa"/>
+            <w:tcMar/>
           </w:tcPr>
           <w:p wp14:textId="77777777">
             <w:r>
@@ -4952,6 +4983,7 @@
         <w:tc>
           <w:tcPr>
             <w:tcW w:w="2880" w:type="dxa"/>
+            <w:tcMar/>
           </w:tcPr>
           <w:p wp14:textId="77777777">
             <w:r>
@@ -4965,6 +4997,7 @@
         <w:tc>
           <w:tcPr>
             <w:tcW w:w="2448" w:type="dxa"/>
+            <w:tcMar/>
           </w:tcPr>
           <w:p wp14:textId="77777777">
             <w:r>
@@ -4978,6 +5011,7 @@
         <w:tc>
           <w:tcPr>
             <w:tcW w:w="1728" w:type="dxa"/>
+            <w:tcMar/>
           </w:tcPr>
           <w:p wp14:textId="77777777">
             <w:r>
@@ -4991,6 +5025,7 @@
         <w:tc>
           <w:tcPr>
             <w:tcW w:w="720" w:type="dxa"/>
+            <w:tcMar/>
           </w:tcPr>
           <w:p wp14:textId="77777777">
             <w:r>
@@ -5004,13 +5039,18 @@
         <w:tc>
           <w:tcPr>
             <w:tcW w:w="864" w:type="dxa"/>
-          </w:tcPr>
-          <w:p wp14:textId="77777777">
-            <w:r>
-              <w:rPr>
-                <w:sz w:val="19"/>
-              </w:rPr>
-              <w:t>25 min</w:t>
+            <w:tcMar/>
+          </w:tcPr>
+          <w:p>
+            <w:pPr>
+              <w:pStyle w:val="Normal"/>
+            </w:pPr>
+            <w:r>
+              <w:rPr>
+                <w:sz w:val="19"/>
+                <w:szCs w:val="19"/>
+              </w:rPr>
+              <w:t>35 min</w:t>
             </w:r>
           </w:p>
         </w:tc>
@@ -5019,6 +5059,7 @@
         <w:tc>
           <w:tcPr>
             <w:tcW w:w="576" w:type="dxa"/>
+            <w:tcMar/>
           </w:tcPr>
           <w:p wp14:textId="77777777">
             <w:r>
@@ -5032,6 +5073,7 @@
         <w:tc>
           <w:tcPr>
             <w:tcW w:w="2880" w:type="dxa"/>
+            <w:tcMar/>
           </w:tcPr>
           <w:p wp14:textId="77777777">
             <w:r>
@@ -5045,6 +5087,7 @@
         <w:tc>
           <w:tcPr>
             <w:tcW w:w="2448" w:type="dxa"/>
+            <w:tcMar/>
           </w:tcPr>
           <w:p wp14:textId="77777777">
             <w:r>
@@ -5058,6 +5101,7 @@
         <w:tc>
           <w:tcPr>
             <w:tcW w:w="1728" w:type="dxa"/>
+            <w:tcMar/>
           </w:tcPr>
           <w:p wp14:textId="77777777">
             <w:r>
@@ -5071,6 +5115,7 @@
         <w:tc>
           <w:tcPr>
             <w:tcW w:w="720" w:type="dxa"/>
+            <w:tcMar/>
           </w:tcPr>
           <w:p wp14:textId="77777777">
             <w:r>
@@ -5084,6 +5129,7 @@
         <w:tc>
           <w:tcPr>
             <w:tcW w:w="864" w:type="dxa"/>
+            <w:tcMar/>
           </w:tcPr>
           <w:p wp14:textId="77777777">
             <w:r>
@@ -5099,6 +5145,7 @@
         <w:tc>
           <w:tcPr>
             <w:tcW w:w="576" w:type="dxa"/>
+            <w:tcMar/>
           </w:tcPr>
           <w:p wp14:textId="77777777">
             <w:r>
@@ -5112,6 +5159,7 @@
         <w:tc>
           <w:tcPr>
             <w:tcW w:w="2880" w:type="dxa"/>
+            <w:tcMar/>
           </w:tcPr>
           <w:p wp14:textId="77777777">
             <w:r>
@@ -5125,6 +5173,7 @@
         <w:tc>
           <w:tcPr>
             <w:tcW w:w="2448" w:type="dxa"/>
+            <w:tcMar/>
           </w:tcPr>
           <w:p wp14:textId="77777777">
             <w:r>
@@ -5138,6 +5187,7 @@
         <w:tc>
           <w:tcPr>
             <w:tcW w:w="1728" w:type="dxa"/>
+            <w:tcMar/>
           </w:tcPr>
           <w:p wp14:textId="77777777">
             <w:r>
@@ -5151,6 +5201,7 @@
         <w:tc>
           <w:tcPr>
             <w:tcW w:w="720" w:type="dxa"/>
+            <w:tcMar/>
           </w:tcPr>
           <w:p wp14:textId="77777777">
             <w:r>
@@ -5164,6 +5215,7 @@
         <w:tc>
           <w:tcPr>
             <w:tcW w:w="864" w:type="dxa"/>
+            <w:tcMar/>
           </w:tcPr>
           <w:p wp14:textId="77777777">
             <w:r>
@@ -5179,6 +5231,7 @@
         <w:tc>
           <w:tcPr>
             <w:tcW w:w="576" w:type="dxa"/>
+            <w:tcMar/>
           </w:tcPr>
           <w:p wp14:textId="77777777">
             <w:r>
@@ -5192,6 +5245,7 @@
         <w:tc>
           <w:tcPr>
             <w:tcW w:w="2880" w:type="dxa"/>
+            <w:tcMar/>
           </w:tcPr>
           <w:p wp14:textId="77777777">
             <w:r>
@@ -5205,6 +5259,7 @@
         <w:tc>
           <w:tcPr>
             <w:tcW w:w="2448" w:type="dxa"/>
+            <w:tcMar/>
           </w:tcPr>
           <w:p wp14:textId="77777777">
             <w:r>
@@ -5218,6 +5273,7 @@
         <w:tc>
           <w:tcPr>
             <w:tcW w:w="1728" w:type="dxa"/>
+            <w:tcMar/>
           </w:tcPr>
           <w:p wp14:textId="77777777">
             <w:r>
@@ -5231,6 +5287,7 @@
         <w:tc>
           <w:tcPr>
             <w:tcW w:w="720" w:type="dxa"/>
+            <w:tcMar/>
           </w:tcPr>
           <w:p wp14:textId="77777777">
             <w:r>
@@ -5244,6 +5301,7 @@
         <w:tc>
           <w:tcPr>
             <w:tcW w:w="864" w:type="dxa"/>
+            <w:tcMar/>
           </w:tcPr>
           <w:p wp14:textId="77777777">
             <w:r>
@@ -5259,6 +5317,7 @@
         <w:tc>
           <w:tcPr>
             <w:tcW w:w="576" w:type="dxa"/>
+            <w:tcMar/>
           </w:tcPr>
           <w:p wp14:textId="77777777">
             <w:r>
@@ -5272,6 +5331,7 @@
         <w:tc>
           <w:tcPr>
             <w:tcW w:w="2880" w:type="dxa"/>
+            <w:tcMar/>
           </w:tcPr>
           <w:p wp14:textId="77777777">
             <w:r>
@@ -5285,6 +5345,7 @@
         <w:tc>
           <w:tcPr>
             <w:tcW w:w="2448" w:type="dxa"/>
+            <w:tcMar/>
           </w:tcPr>
           <w:p wp14:textId="77777777">
             <w:r>
@@ -5298,6 +5359,7 @@
         <w:tc>
           <w:tcPr>
             <w:tcW w:w="1728" w:type="dxa"/>
+            <w:tcMar/>
           </w:tcPr>
           <w:p wp14:textId="77777777">
             <w:r>
@@ -5311,6 +5373,7 @@
         <w:tc>
           <w:tcPr>
             <w:tcW w:w="720" w:type="dxa"/>
+            <w:tcMar/>
           </w:tcPr>
           <w:p wp14:textId="77777777">
             <w:r>
@@ -5324,6 +5387,7 @@
         <w:tc>
           <w:tcPr>
             <w:tcW w:w="864" w:type="dxa"/>
+            <w:tcMar/>
           </w:tcPr>
           <w:p wp14:textId="77777777">
             <w:r>
@@ -5339,6 +5403,7 @@
         <w:tc>
           <w:tcPr>
             <w:tcW w:w="576" w:type="dxa"/>
+            <w:tcMar/>
           </w:tcPr>
           <w:p wp14:textId="77777777">
             <w:r>
@@ -5352,6 +5417,7 @@
         <w:tc>
           <w:tcPr>
             <w:tcW w:w="2880" w:type="dxa"/>
+            <w:tcMar/>
           </w:tcPr>
           <w:p wp14:textId="77777777">
             <w:r>
@@ -5365,6 +5431,7 @@
         <w:tc>
           <w:tcPr>
             <w:tcW w:w="2448" w:type="dxa"/>
+            <w:tcMar/>
           </w:tcPr>
           <w:p wp14:textId="77777777">
             <w:r>
@@ -5378,6 +5445,7 @@
         <w:tc>
           <w:tcPr>
             <w:tcW w:w="1728" w:type="dxa"/>
+            <w:tcMar/>
           </w:tcPr>
           <w:p wp14:textId="77777777">
             <w:r>
@@ -5391,6 +5459,7 @@
         <w:tc>
           <w:tcPr>
             <w:tcW w:w="720" w:type="dxa"/>
+            <w:tcMar/>
           </w:tcPr>
           <w:p wp14:textId="77777777">
             <w:r>
@@ -5404,6 +5473,7 @@
         <w:tc>
           <w:tcPr>
             <w:tcW w:w="864" w:type="dxa"/>
+            <w:tcMar/>
           </w:tcPr>
           <w:p wp14:textId="77777777">
             <w:r>
@@ -5419,6 +5489,7 @@
         <w:tc>
           <w:tcPr>
             <w:tcW w:w="576" w:type="dxa"/>
+            <w:tcMar/>
           </w:tcPr>
           <w:p wp14:textId="77777777">
             <w:r>
@@ -5432,6 +5503,7 @@
         <w:tc>
           <w:tcPr>
             <w:tcW w:w="2880" w:type="dxa"/>
+            <w:tcMar/>
           </w:tcPr>
           <w:p wp14:textId="77777777">
             <w:r>
@@ -5445,6 +5517,7 @@
         <w:tc>
           <w:tcPr>
             <w:tcW w:w="2448" w:type="dxa"/>
+            <w:tcMar/>
           </w:tcPr>
           <w:p wp14:textId="77777777">
             <w:r>
@@ -5458,6 +5531,7 @@
         <w:tc>
           <w:tcPr>
             <w:tcW w:w="1728" w:type="dxa"/>
+            <w:tcMar/>
           </w:tcPr>
           <w:p wp14:textId="77777777">
             <w:r>
@@ -5471,6 +5545,7 @@
         <w:tc>
           <w:tcPr>
             <w:tcW w:w="720" w:type="dxa"/>
+            <w:tcMar/>
           </w:tcPr>
           <w:p wp14:textId="77777777">
             <w:r>
@@ -5484,6 +5559,7 @@
         <w:tc>
           <w:tcPr>
             <w:tcW w:w="864" w:type="dxa"/>
+            <w:tcMar/>
           </w:tcPr>
           <w:p wp14:textId="77777777">
             <w:r>
@@ -5499,6 +5575,7 @@
         <w:tc>
           <w:tcPr>
             <w:tcW w:w="576" w:type="dxa"/>
+            <w:tcMar/>
           </w:tcPr>
           <w:p wp14:textId="77777777">
             <w:r>
@@ -5512,6 +5589,7 @@
         <w:tc>
           <w:tcPr>
             <w:tcW w:w="2880" w:type="dxa"/>
+            <w:tcMar/>
           </w:tcPr>
           <w:p wp14:textId="77777777">
             <w:r>
@@ -5525,6 +5603,7 @@
         <w:tc>
           <w:tcPr>
             <w:tcW w:w="2448" w:type="dxa"/>
+            <w:tcMar/>
           </w:tcPr>
           <w:p wp14:textId="77777777">
             <w:r>
@@ -5538,6 +5617,7 @@
         <w:tc>
           <w:tcPr>
             <w:tcW w:w="1728" w:type="dxa"/>
+            <w:tcMar/>
           </w:tcPr>
           <w:p wp14:textId="77777777">
             <w:r>
@@ -5551,6 +5631,7 @@
         <w:tc>
           <w:tcPr>
             <w:tcW w:w="720" w:type="dxa"/>
+            <w:tcMar/>
           </w:tcPr>
           <w:p wp14:textId="77777777">
             <w:r>
@@ -5564,6 +5645,7 @@
         <w:tc>
           <w:tcPr>
             <w:tcW w:w="864" w:type="dxa"/>
+            <w:tcMar/>
           </w:tcPr>
           <w:p wp14:textId="77777777">
             <w:r>
@@ -5579,6 +5661,7 @@
         <w:tc>
           <w:tcPr>
             <w:tcW w:w="576" w:type="dxa"/>
+            <w:tcMar/>
           </w:tcPr>
           <w:p wp14:textId="77777777">
             <w:r>
@@ -5592,6 +5675,7 @@
         <w:tc>
           <w:tcPr>
             <w:tcW w:w="2880" w:type="dxa"/>
+            <w:tcMar/>
           </w:tcPr>
           <w:p wp14:textId="77777777">
             <w:r>
@@ -5605,6 +5689,7 @@
         <w:tc>
           <w:tcPr>
             <w:tcW w:w="2448" w:type="dxa"/>
+            <w:tcMar/>
           </w:tcPr>
           <w:p wp14:textId="77777777">
             <w:r>
@@ -5618,6 +5703,7 @@
         <w:tc>
           <w:tcPr>
             <w:tcW w:w="1728" w:type="dxa"/>
+            <w:tcMar/>
           </w:tcPr>
           <w:p wp14:textId="77777777">
             <w:r>
@@ -5631,6 +5717,7 @@
         <w:tc>
           <w:tcPr>
             <w:tcW w:w="720" w:type="dxa"/>
+            <w:tcMar/>
           </w:tcPr>
           <w:p wp14:textId="77777777">
             <w:r>
@@ -5644,6 +5731,7 @@
         <w:tc>
           <w:tcPr>
             <w:tcW w:w="864" w:type="dxa"/>
+            <w:tcMar/>
           </w:tcPr>
           <w:p wp14:textId="77777777">
             <w:r>
@@ -5659,6 +5747,7 @@
         <w:tc>
           <w:tcPr>
             <w:tcW w:w="576" w:type="dxa"/>
+            <w:tcMar/>
           </w:tcPr>
           <w:p wp14:textId="77777777">
             <w:r>
@@ -5672,6 +5761,7 @@
         <w:tc>
           <w:tcPr>
             <w:tcW w:w="2880" w:type="dxa"/>
+            <w:tcMar/>
           </w:tcPr>
           <w:p wp14:textId="77777777">
             <w:r>
@@ -5685,6 +5775,7 @@
         <w:tc>
           <w:tcPr>
             <w:tcW w:w="2448" w:type="dxa"/>
+            <w:tcMar/>
           </w:tcPr>
           <w:p wp14:textId="77777777">
             <w:r>
@@ -5698,6 +5789,7 @@
         <w:tc>
           <w:tcPr>
             <w:tcW w:w="1728" w:type="dxa"/>
+            <w:tcMar/>
           </w:tcPr>
           <w:p wp14:textId="77777777">
             <w:r>
@@ -5711,6 +5803,7 @@
         <w:tc>
           <w:tcPr>
             <w:tcW w:w="720" w:type="dxa"/>
+            <w:tcMar/>
           </w:tcPr>
           <w:p wp14:textId="77777777">
             <w:r>
@@ -5724,6 +5817,7 @@
         <w:tc>
           <w:tcPr>
             <w:tcW w:w="864" w:type="dxa"/>
+            <w:tcMar/>
           </w:tcPr>
           <w:p wp14:textId="77777777">
             <w:r>
@@ -5739,6 +5833,7 @@
         <w:tc>
           <w:tcPr>
             <w:tcW w:w="576" w:type="dxa"/>
+            <w:tcMar/>
           </w:tcPr>
           <w:p wp14:textId="77777777">
             <w:r>
@@ -5752,6 +5847,7 @@
         <w:tc>
           <w:tcPr>
             <w:tcW w:w="2880" w:type="dxa"/>
+            <w:tcMar/>
           </w:tcPr>
           <w:p wp14:textId="77777777">
             <w:r>
@@ -5765,6 +5861,7 @@
         <w:tc>
           <w:tcPr>
             <w:tcW w:w="2448" w:type="dxa"/>
+            <w:tcMar/>
           </w:tcPr>
           <w:p wp14:textId="77777777">
             <w:r>
@@ -5778,6 +5875,7 @@
         <w:tc>
           <w:tcPr>
             <w:tcW w:w="1728" w:type="dxa"/>
+            <w:tcMar/>
           </w:tcPr>
           <w:p wp14:textId="77777777">
             <w:r>
@@ -5791,6 +5889,7 @@
         <w:tc>
           <w:tcPr>
             <w:tcW w:w="720" w:type="dxa"/>
+            <w:tcMar/>
           </w:tcPr>
           <w:p wp14:textId="77777777">
             <w:r>
@@ -5804,6 +5903,7 @@
         <w:tc>
           <w:tcPr>
             <w:tcW w:w="864" w:type="dxa"/>
+            <w:tcMar/>
           </w:tcPr>
           <w:p wp14:textId="77777777">
             <w:r>
@@ -9053,7 +9153,8 @@
         <w:tc>
           <w:tcPr>
             <w:tcW w:w="1152" w:type="dxa"/>
-            <w:shd w:val="clear" w:fill="0B3D2E"/>
+            <w:shd w:val="clear" w:color="auto" w:fill="0B3D2E"/>
+            <w:tcMar/>
           </w:tcPr>
           <w:p wp14:textId="77777777">
             <w:r>
@@ -9069,7 +9170,8 @@
         <w:tc>
           <w:tcPr>
             <w:tcW w:w="1440" w:type="dxa"/>
-            <w:shd w:val="clear" w:fill="0B3D2E"/>
+            <w:shd w:val="clear" w:color="auto" w:fill="0B3D2E"/>
+            <w:tcMar/>
           </w:tcPr>
           <w:p wp14:textId="77777777">
             <w:r>
@@ -9085,7 +9187,8 @@
         <w:tc>
           <w:tcPr>
             <w:tcW w:w="3168" w:type="dxa"/>
-            <w:shd w:val="clear" w:fill="0B3D2E"/>
+            <w:shd w:val="clear" w:color="auto" w:fill="0B3D2E"/>
+            <w:tcMar/>
           </w:tcPr>
           <w:p wp14:textId="77777777">
             <w:r>
@@ -9101,7 +9204,8 @@
         <w:tc>
           <w:tcPr>
             <w:tcW w:w="3600" w:type="dxa"/>
-            <w:shd w:val="clear" w:fill="0B3D2E"/>
+            <w:shd w:val="clear" w:color="auto" w:fill="0B3D2E"/>
+            <w:tcMar/>
           </w:tcPr>
           <w:p wp14:textId="77777777">
             <w:r>
@@ -9119,6 +9223,7 @@
         <w:tc>
           <w:tcPr>
             <w:tcW w:w="1152" w:type="dxa"/>
+            <w:tcMar/>
           </w:tcPr>
           <w:p wp14:textId="77777777">
             <w:r>
@@ -9132,19 +9237,25 @@
         <w:tc>
           <w:tcPr>
             <w:tcW w:w="1440" w:type="dxa"/>
-          </w:tcPr>
-          <w:p wp14:textId="77777777">
-            <w:r>
-              <w:rPr>
-                <w:sz w:val="19"/>
-              </w:rPr>
-              <w:t>25 minutes</w:t>
+            <w:tcMar/>
+          </w:tcPr>
+          <w:p>
+            <w:pPr>
+              <w:pStyle w:val="Normal"/>
+            </w:pPr>
+            <w:r>
+              <w:rPr>
+                <w:sz w:val="19"/>
+                <w:szCs w:val="19"/>
+              </w:rPr>
+              <w:t>35 minutes</w:t>
             </w:r>
           </w:p>
         </w:tc>
         <w:tc>
           <w:tcPr>
             <w:tcW w:w="3168" w:type="dxa"/>
+            <w:tcMar/>
           </w:tcPr>
           <w:p wp14:textId="77777777">
             <w:r>
@@ -9158,6 +9269,7 @@
         <w:tc>
           <w:tcPr>
             <w:tcW w:w="3600" w:type="dxa"/>
+            <w:tcMar/>
           </w:tcPr>
           <w:p wp14:textId="77777777">
             <w:r>
@@ -9210,17 +9322,20 @@
       </w:r>
       <w:bookmarkEnd w:id="1680692436"/>
     </w:p>
-    <w:p xmlns:wp14="http://schemas.microsoft.com/office/word/2010/wordml" wp14:textId="77777777">
-      <w:pPr>
-        <w:spacing w:after="120"/>
+    <w:p>
+      <w:pPr>
+        <w:pStyle w:val="Normal"/>
       </w:pPr>
       <w:r>
         <w:rPr>
           <w:b w:val="0"/>
+          <w:bCs w:val="0"/>
           <w:i w:val="0"/>
+          <w:iCs w:val="0"/>
           <w:sz w:val="21"/>
+          <w:szCs w:val="21"/>
         </w:rPr>
-        <w:t>A cluster of high-priority billing complaints has hit Contoso Financial. You must communicate crisply to very different audiences - the support team, affected business owners, and executives - without leaking customer data or overcommitting.</w:t>
+        <w:t>A cluster of high-priority billing complaints has hit Contoso Financial. You must communicate crisply to very different audiences - the support team, affected business owners, and executives - without leaking customer data or overcommitting. The same Outlook habits carry into an ordinary day, so this lab also covers the daily rhythm: triaging what arrived overnight, tracking the replies you still owe, and checking tone, commitments, and privacy before anything is sent.</w:t>
       </w:r>
     </w:p>
     <w:p xmlns:wp14="http://schemas.microsoft.com/office/word/2010/wordml" wp14:textId="77777777">
@@ -9270,12 +9385,27 @@
     <w:p xmlns:wp14="http://schemas.microsoft.com/office/word/2010/wordml" wp14:textId="77777777">
       <w:pPr>
         <w:pStyle w:val="ListBullet"/>
+        <w:rPr/>
       </w:pPr>
       <w:r>
         <w:rPr>
           <w:sz w:val="21"/>
+          <w:szCs w:val="21"/>
         </w:rPr>
         <w:t>Validate tone, commitments, and privacy before sending.</w:t>
+      </w:r>
+    </w:p>
+    <w:p>
+      <w:pPr>
+        <w:pStyle w:val="ListBullet"/>
+        <w:rPr/>
+      </w:pPr>
+      <w:r>
+        <w:rPr>
+          <w:sz w:val="21"/>
+          <w:szCs w:val="21"/>
+        </w:rPr>
+        <w:t>Run a daily inbox triage and follow-up prompt in Outlook, so the same summarising, drafting, and validation habits apply on an ordinary day and not only during an escalation.</w:t>
       </w:r>
     </w:p>
     <w:p xmlns:wp14="http://schemas.microsoft.com/office/word/2010/wordml" wp14:textId="77777777">
@@ -9505,12 +9635,251 @@
         <w:spacing w:after="40"/>
       </w:pPr>
     </w:p>
-    <w:p xmlns:wp14="http://schemas.microsoft.com/office/word/2010/wordml" wp14:textId="77777777">
+    <w:p>
       <w:pPr>
         <w:pStyle w:val="Heading3"/>
       </w:pPr>
       <w:r>
-        <w:t>Exercise 3 - Follow-up action tracker</w:t>
+        <w:rPr/>
+        <w:t>Exercise 3 - Daily inbox triage</w:t>
+      </w:r>
+    </w:p>
+    <w:p>
+      <w:pPr>
+        <w:pStyle w:val="Normal"/>
+      </w:pPr>
+      <w:r>
+        <w:rPr>
+          <w:sz w:val="22"/>
+          <w:szCs w:val="22"/>
+        </w:rPr>
+        <w:t xml:space="preserve">☐  </w:t>
+      </w:r>
+      <w:r>
+        <w:rPr>
+          <w:sz w:val="21"/>
+          <w:szCs w:val="21"/>
+        </w:rPr>
+        <w:t>Escalations are occasional; the inbox is daily. Run this prompt in Copilot in Outlook at the start of a working day against your own mock mailbox.</w:t>
+      </w:r>
+    </w:p>
+    <w:tbl>
+      <w:tblPr>
+        <w:tblStyle w:val="TableGrid"/>
+        <w:tblW w:w="0" w:type="auto"/>
+        <w:tblLook w:val="04A0" w:firstRow="1" w:lastRow="0" w:firstColumn="1" w:lastColumn="0" w:noHBand="0" w:noVBand="1"/>
+      </w:tblPr>
+      <w:tblGrid>
+        <w:gridCol w:w="8640"/>
+      </w:tblGrid>
+      <w:tr>
+        <w:tc>
+          <w:tcPr>
+            <w:tcW w:w="8640" w:type="dxa"/>
+            <w:shd w:val="clear" w:color="auto" w:fill="F1F5F4"/>
+            <w:tcMar/>
+          </w:tcPr>
+          <w:p>
+            <w:pPr>
+              <w:pStyle w:val="Normal"/>
+            </w:pPr>
+            <w:r>
+              <w:rPr>
+                <w:rFonts w:ascii="Consolas" w:hAnsi="Consolas" w:eastAsia="Consolas" w:cs="Consolas"/>
+                <w:color w:val="334155"/>
+                <w:sz w:val="19"/>
+                <w:szCs w:val="19"/>
+              </w:rPr>
+              <w:t>Summarise the mail I received in the last twenty-four hours. Group it as:</w:t>
+            </w:r>
+          </w:p>
+          <w:p>
+            <w:pPr>
+              <w:pStyle w:val="Normal"/>
+            </w:pPr>
+            <w:r>
+              <w:rPr>
+                <w:rFonts w:ascii="Consolas" w:hAnsi="Consolas" w:eastAsia="Consolas" w:cs="Consolas"/>
+                <w:color w:val="334155"/>
+                <w:sz w:val="19"/>
+                <w:szCs w:val="19"/>
+              </w:rPr>
+              <w:t>- needs a reply from me today</w:t>
+            </w:r>
+          </w:p>
+          <w:p>
+            <w:pPr>
+              <w:pStyle w:val="Normal"/>
+            </w:pPr>
+            <w:r>
+              <w:rPr>
+                <w:rFonts w:ascii="Consolas" w:hAnsi="Consolas" w:eastAsia="Consolas" w:cs="Consolas"/>
+                <w:color w:val="334155"/>
+                <w:sz w:val="19"/>
+                <w:szCs w:val="19"/>
+              </w:rPr>
+              <w:t>- needs a reply this week</w:t>
+            </w:r>
+          </w:p>
+          <w:p>
+            <w:pPr>
+              <w:pStyle w:val="Normal"/>
+            </w:pPr>
+            <w:r>
+              <w:rPr>
+                <w:rFonts w:ascii="Consolas" w:hAnsi="Consolas" w:eastAsia="Consolas" w:cs="Consolas"/>
+                <w:color w:val="334155"/>
+                <w:sz w:val="19"/>
+                <w:szCs w:val="19"/>
+              </w:rPr>
+              <w:t>- waiting on someone else</w:t>
+            </w:r>
+          </w:p>
+          <w:p>
+            <w:pPr>
+              <w:pStyle w:val="Normal"/>
+            </w:pPr>
+            <w:r>
+              <w:rPr>
+                <w:rFonts w:ascii="Consolas" w:hAnsi="Consolas" w:eastAsia="Consolas" w:cs="Consolas"/>
+                <w:color w:val="334155"/>
+                <w:sz w:val="19"/>
+                <w:szCs w:val="19"/>
+              </w:rPr>
+              <w:t>- read only</w:t>
+            </w:r>
+          </w:p>
+          <w:p>
+            <w:pPr>
+              <w:pStyle w:val="Normal"/>
+            </w:pPr>
+            <w:r>
+              <w:rPr>
+                <w:rFonts w:ascii="Consolas" w:hAnsi="Consolas" w:eastAsia="Consolas" w:cs="Consolas"/>
+                <w:color w:val="334155"/>
+                <w:sz w:val="19"/>
+                <w:szCs w:val="19"/>
+              </w:rPr>
+              <w:t>For each item give the sender, the ask in one line, and a suggested next</w:t>
+            </w:r>
+          </w:p>
+          <w:p>
+            <w:pPr>
+              <w:pStyle w:val="Normal"/>
+            </w:pPr>
+            <w:r>
+              <w:rPr>
+                <w:rFonts w:ascii="Consolas" w:hAnsi="Consolas" w:eastAsia="Consolas" w:cs="Consolas"/>
+                <w:color w:val="334155"/>
+                <w:sz w:val="19"/>
+                <w:szCs w:val="19"/>
+              </w:rPr>
+              <w:t>step. List separately every commitment or deadline I have made, and flag</w:t>
+            </w:r>
+          </w:p>
+          <w:p>
+            <w:pPr>
+              <w:pStyle w:val="Normal"/>
+            </w:pPr>
+            <w:r>
+              <w:rPr>
+                <w:rFonts w:ascii="Consolas" w:hAnsi="Consolas" w:eastAsia="Consolas" w:cs="Consolas"/>
+                <w:color w:val="334155"/>
+                <w:sz w:val="19"/>
+                <w:szCs w:val="19"/>
+              </w:rPr>
+              <w:t>anything that reads like an escalation.</w:t>
+            </w:r>
+          </w:p>
+          <w:p>
+            <w:pPr>
+              <w:pStyle w:val="Normal"/>
+            </w:pPr>
+            <w:r>
+              <w:rPr>
+                <w:rFonts w:ascii="Consolas" w:hAnsi="Consolas" w:eastAsia="Consolas" w:cs="Consolas"/>
+                <w:color w:val="334155"/>
+                <w:sz w:val="19"/>
+                <w:szCs w:val="19"/>
+              </w:rPr>
+              <w:t>Use only messages from the last twenty-four hours, and do not quote customer</w:t>
+            </w:r>
+          </w:p>
+          <w:p>
+            <w:pPr>
+              <w:pStyle w:val="Normal"/>
+            </w:pPr>
+            <w:r>
+              <w:rPr>
+                <w:rFonts w:ascii="Consolas" w:hAnsi="Consolas" w:eastAsia="Consolas" w:cs="Consolas"/>
+                <w:color w:val="334155"/>
+                <w:sz w:val="19"/>
+                <w:szCs w:val="19"/>
+              </w:rPr>
+              <w:t>personal or payment data in the summary.</w:t>
+            </w:r>
+          </w:p>
+        </w:tc>
+      </w:tr>
+    </w:tbl>
+    <w:p>
+      <w:pPr>
+        <w:pStyle w:val="Normal"/>
+      </w:pPr>
+    </w:p>
+    <w:tbl>
+      <w:tblPr>
+        <w:tblStyle w:val="TableGrid"/>
+        <w:tblW w:w="0" w:type="auto"/>
+        <w:tblLook w:val="04A0" w:firstRow="1" w:lastRow="0" w:firstColumn="1" w:lastColumn="0" w:noHBand="0" w:noVBand="1"/>
+      </w:tblPr>
+      <w:tblGrid>
+        <w:gridCol w:w="8640"/>
+      </w:tblGrid>
+      <w:tr>
+        <w:tc>
+          <w:tcPr>
+            <w:tcW w:w="8640" w:type="dxa"/>
+            <w:shd w:val="clear" w:color="auto" w:fill="FBEEE6"/>
+            <w:tcMar/>
+          </w:tcPr>
+          <w:p>
+            <w:pPr>
+              <w:pStyle w:val="Normal"/>
+            </w:pPr>
+            <w:r>
+              <w:rPr>
+                <w:b w:val="1"/>
+                <w:bCs w:val="1"/>
+                <w:color w:val="9A3412"/>
+                <w:sz w:val="21"/>
+                <w:szCs w:val="21"/>
+              </w:rPr>
+              <w:t xml:space="preserve">Validation: </w:t>
+            </w:r>
+            <w:r>
+              <w:rPr>
+                <w:sz w:val="21"/>
+                <w:szCs w:val="21"/>
+              </w:rPr>
+              <w:t>This prompt reads your live mailbox, so check the triage before you act on it. Open two or three messages from each group and confirm the sender, the ask, and the suggested next step match what the mail actually says. Verify that every commitment and deadline listed is one you really made, and that nothing older than twenty-four hours has been pulled in. Confirm no customer personal or payment data appears in the summary, and delete or re-run the output if it does. Copilot may miss a message it could not access, so treat the triage as a starting point rather than a complete inbox.</w:t>
+            </w:r>
+          </w:p>
+        </w:tc>
+      </w:tr>
+    </w:tbl>
+    <w:p>
+      <w:pPr>
+        <w:pStyle w:val="Normal"/>
+      </w:pPr>
+    </w:p>
+    <w:p>
+      <w:pPr>
+        <w:pStyle w:val="Heading3"/>
+      </w:pPr>
+      <w:r>
+        <w:rPr/>
+        <w:t>Exercise 4 - Follow-up action tracker</w:t>
       </w:r>
     </w:p>
     <w:tbl>
@@ -17994,7 +18363,7 @@
           <w:sz w:val="21"/>
           <w:szCs w:val="21"/>
         </w:rPr>
-        <w:t>Week 1 - Each participant picks one recurring task from their own role and rewrites it as a prompt using the scaffold in Appendix A.</w:t>
+        <w:t>Week 1 - Each participant picks one recurring task from their own role and rewrites it as a prompt using the scaffold in Appendix A, and runs the daily Outlook triage prompt from Lab 04 every morning so at least one Copilot habit is practised each working day rather than once in the week.</w:t>
       </w:r>
     </w:p>
     <w:p>
@@ -31580,7 +31949,7 @@
     <w:basedOn w:val="Normal"/>
     <w:next w:val="Normal"/>
     <w:unhideWhenUsed/>
-    <w:rsid w:val="3124A752"/>
+    <w:rsid w:val="33BB61B9"/>
     <w:pPr>
       <w:spacing w:after="100"/>
     </w:pPr>
@@ -31591,7 +31960,7 @@
     <w:basedOn w:val="Normal"/>
     <w:next w:val="Normal"/>
     <w:unhideWhenUsed/>
-    <w:rsid w:val="3124A752"/>
+    <w:rsid w:val="33BB61B9"/>
     <w:pPr>
       <w:spacing w:after="100"/>
       <w:ind w:left="220"/>

</xml_diff>